<commit_message>
mejora: unifica exportación, robustece el parseo PDF y amplía el editor
Aplica una sola fuente a todo el DOCX/PDF y elimina la opción de fuente de plantilla. Agrega reordenamiento para módulos, entradas, hitos y skills con estados visuales y animación. Generaliza educación con items opcionales en lugar de honores fijos. Endurece el parseo para casos como GPA, Honors y Honores, manteniendo compatibilidad con formatos antiguos. Actualiza pruebas, documentación y recursos de ejemplo para la versión 1.2.0.
</commit_message>
<xml_diff>
--- a/templates/cv_template.docx
+++ b/templates/cv_template.docx
@@ -106,7 +106,7 @@
               <w:fldChar w:fldCharType="begin"/>
             </w:r>
             <w:r>
-              <w:instrText>HYPERLINK "mailto:halanvd@outlook.com"</w:instrText>
+              <w:instrText>HYPERLINK "mailto:correo@example.com"</w:instrText>
             </w:r>
             <w:r>
               <w:fldChar w:fldCharType="separate"/>
@@ -130,7 +130,7 @@
               <w:fldChar w:fldCharType="begin"/>
             </w:r>
             <w:r>
-              <w:instrText>HYPERLINK "https://github.com/Skalis07/"</w:instrText>
+              <w:instrText>HYPERLINK "https://github.com/usuario/"</w:instrText>
             </w:r>
             <w:r>
               <w:fldChar w:fldCharType="separate"/>

</xml_diff>